<commit_message>
Actualizar metodología, recursos, evaluación y descripciones de actividades
- Metodología: párrafo introductorio y justificación de cada enfoque, con
  cita de Mera Holguín et al. (2025).
- Recursos: materiales acordes a las nuevas actividades.
- Evaluación: criterios alineados con las seis actividades, sin actividades
  con personas externas a los niños.
- Descripciones de actividades reducidas a entre 15 y 20 palabras.

Co-Authored-By: Claude Opus 5.5 <noreply@anthropic.com>
Claude-Session: https://claude.ai/code/session_01AVWyCRrJVLCjKKjvdVVMfU
</commit_message>
<xml_diff>
--- a/NIKOL_PROYECTO_DE_VINCULACION.docx
+++ b/NIKOL_PROYECTO_DE_VINCULACION.docx
@@ -3096,6 +3096,11 @@
       <w:bookmarkEnd w:id="13"/>
     </w:p>
     <w:p>
+      <w:r>
+        <w:t>En este proyecto se utilizaron tres enfoques: educativo, participativo y asistencial. Se eligieron en conjunto porque la dificultad de los niños de cuarto año para reconocer sus emociones y resolver sus conflictos no se soluciona solo con explicar el tema. Los niños necesitaban aprender qué son las emociones, practicar con sus compañeros cómo manejarlas y, en algunos casos, recibir un acompañamiento más cercano. Cada enfoque responde a una de estas necesidades.</w:t>
+      </w:r>
+    </w:p>
+    <w:p>
       <w:pPr>
         <w:pStyle w:val="Ttulo2"/>
       </w:pPr>
@@ -3132,7 +3137,7 @@
         </w:sdtContent>
       </w:sdt>
       <w:r>
-        <w:t xml:space="preserve">. En este proyecto cada taller tuvo un tema claro con una explicación sencilla y ejemplos cercanos a la edad de los estudiantes como el aula y el juego. Los estudiantes no solo escucharon el tema sino que también lo practicaron en cada clase.</w:t>
+        <w:t xml:space="preserve">. Se eligió este enfoque porque los niños no sabían nombrar lo que sentían ni cómo controlarlo, por lo que primero era necesario enseñarles de forma sencilla qué son las emociones y qué pueden hacer con ellas. En este proyecto cada taller tuvo un tema claro con una explicación sencilla y ejemplos cercanos a la edad de los niños, como el aula y el juego. Los niños no solo escucharon el tema, sino que también lo practicaron en cada clase.</w:t>
       </w:r>
     </w:p>
     <w:p>
@@ -3172,7 +3177,32 @@
         </w:sdtContent>
       </w:sdt>
       <w:r>
-        <w:t>. En los talleres se aplicó con dinámicas de grupo y conversaciones donde los estudiantes daban su opinión y proponían cómo resolver los desacuerdos que surgían. No se les dio todo resuelto, sino que ellos mismos pensaron formas de actuar frente a un conflicto y se sintieron parte del proceso.</w:t>
+        <w:t xml:space="preserve">. Se eligió este enfoque porque el manejo de las emociones y la resolución de conflictos no se aprenden solo escuchando, sino practicando con los compañeros en situaciones parecidas a las que viven en el aula. Las metodologías activas y participativas convierten al estudiante en protagonista de su propio aprendizaje </w:t>
+      </w:r>
+      <w:sdt>
+        <w:sdtPr>
+          <w:id w:val="1847562013"/>
+          <w:citation/>
+        </w:sdtPr>
+        <w:sdtContent>
+          <w:r>
+            <w:fldChar w:fldCharType="begin"/>
+            <w:instrText xml:space="preserve"> CITATION ED86f1f5c018f44982 \l 12298 </w:instrText>
+            <w:fldChar w:fldCharType="separate"/>
+          </w:r>
+          <w:r>
+            <w:rPr>
+              <w:noProof/>
+            </w:rPr>
+            <w:t>(Mera Holguín et al., 2025)</w:t>
+          </w:r>
+          <w:r>
+            <w:fldChar w:fldCharType="end"/>
+          </w:r>
+        </w:sdtContent>
+      </w:sdt>
+      <w:r>
+        <w:t>. En los talleres se aplicó con dinámicas de grupo y conversaciones donde los niños daban su opinión y proponían cómo resolver los desacuerdos que surgían. No se les dio todo resuelto, sino que ellos mismos pensaron formas de actuar frente a un conflicto y se sintieron parte del proceso.</w:t>
       </w:r>
     </w:p>
     <w:p>
@@ -3212,7 +3242,7 @@
         </w:sdtContent>
       </w:sdt>
       <w:r>
-        <w:t>. Esa ayuda se dio acompañando de cerca a los niños con más dificultad para controlar sus emociones y resolver sus conflictos hablando con ellos y ayudándolos a calmarse cuando lo necesitaban. El proyecto no solo enseñó el tema, sino que también atendió lo que cada estudiante necesitaba.</w:t>
+        <w:t>. Se eligió este enfoque porque no todos los niños tenían el mismo nivel de dificultad y algunos necesitaban más apoyo para calmarse y expresar lo que sentían. Esa ayuda se dio acompañando de cerca a los niños con más dificultad para controlar sus emociones y resolver sus conflictos, hablando con ellos y ayudándolos a calmarse cuando lo necesitaban. El proyecto no solo enseñó el tema, sino que también atendió lo que cada niño necesitaba.</w:t>
       </w:r>
     </w:p>
     <w:p>
@@ -3496,7 +3526,7 @@
                 <w:lang w:eastAsia="es-EC"/>
                 <w14:ligatures w14:val="none"/>
               </w:rPr>
-              <w:t xml:space="preserve">Se muestran a los niños tarjetas con caritas de alegría, tristeza, enojo, miedo y frustración. Cada niño escoge la carita que muestra cómo se siente en momentos del día escolar, como el recreo, los juegos o las tareas, y cuenta por qué se siente así. Con sus respuestas se identifican las emociones más frecuentes del grupo y los niños que tienen más dificultad para expresarlas.</w:t>
+              <w:t xml:space="preserve">Con tarjetas de caritas, los niños expresan cómo se sienten en el recreo, los juegos y las tareas.</w:t>
             </w:r>
           </w:p>
         </w:tc>
@@ -3610,7 +3640,7 @@
                 <w:lang w:eastAsia="es-EC"/>
                 <w14:ligatures w14:val="none"/>
               </w:rPr>
-              <w:t xml:space="preserve">Se leen situaciones comunes del aula, como perder en un juego, recibir una burla o no ser escogido para un grupo. Los niños levantan una paleta verde, amarilla o roja según lo tranquilos o molestos que se sentirían en cada situación. Luego conversan sobre cómo suelen reaccionar, lo que permite conocer qué situaciones generan más conflictos entre compañeros.</w:t>
+              <w:t xml:space="preserve">Los niños levantan paletas de colores según cómo se sentirían ante burlas o juegos perdidos.</w:t>
             </w:r>
           </w:p>
         </w:tc>
@@ -3733,7 +3763,7 @@
                 <w:lang w:eastAsia="es-EC"/>
                 <w14:ligatures w14:val="none"/>
               </w:rPr>
-              <w:t xml:space="preserve">Los niños colorean un termómetro para mostrar qué tan fuerte es su enojo, tristeza o frustración en distintas situaciones. Después aprenden técnicas sencillas para calmarse: la respiración del globo, la técnica de la tortuga y contar hasta diez. Por último las practican en parejas con ejemplos de situaciones que les causan malestar.</w:t>
+              <w:t xml:space="preserve">Los niños miden su enojo en un termómetro y practican la respiración del globo y la técnica de la tortuga.</w:t>
             </w:r>
           </w:p>
         </w:tc>
@@ -3856,7 +3886,7 @@
                 <w:lang w:eastAsia="es-EC"/>
                 <w14:ligatures w14:val="none"/>
               </w:rPr>
-              <w:t xml:space="preserve">Los niños aprenden cuatro pasos para resolver un desacuerdo: calmarse, decir lo que sienten con la frase “yo me siento… cuando…”, escuchar al compañero sin interrumpir y buscar juntos una solución. En parejas representan conflictos comunes del aula, como pelear por un material o por el turno en un juego, y los resuelven frente al grupo aplicando estos pasos.</w:t>
+              <w:t xml:space="preserve">En parejas, los niños representan conflictos del aula y los resuelven calmándose, escuchando y llegando a un acuerdo.</w:t>
             </w:r>
           </w:p>
         </w:tc>
@@ -3979,7 +4009,7 @@
                 <w:lang w:eastAsia="es-EC"/>
                 <w14:ligatures w14:val="none"/>
               </w:rPr>
-              <w:t xml:space="preserve">Los niños forman equipos y realizan juegos en los que solo pueden ganar si todos colaboran, como armar un rompecabezas grande o llevar un globo sin usar las manos. Al terminar cada juego conversan sobre cómo se sintieron, cómo se ayudaron y qué hicieron cuando no estaban de acuerdo. Así practican el respeto, la empatía y el trabajo en equipo.</w:t>
+              <w:t xml:space="preserve">Los niños realizan juegos en equipo donde solo ganan si todos colaboran, y luego conversan sobre cómo se ayudaron.</w:t>
             </w:r>
           </w:p>
         </w:tc>
@@ -4102,7 +4132,7 @@
                 <w:lang w:eastAsia="es-EC"/>
                 <w14:ligatures w14:val="none"/>
               </w:rPr>
-              <w:t xml:space="preserve">Los niños recuerdan lo aprendido mostrando con ejemplos cómo reconocen sus emociones, cómo se calman y cómo resuelven un desacuerdo. Después proponen entre todos acuerdos para convivir mejor, los escriben en un papelógrafo y los firman con su huella como compromiso. El pacto queda pegado en el aula para recordarlo cada día.</w:t>
+              <w:t xml:space="preserve">Los niños repasan lo aprendido, proponen acuerdos de convivencia para el aula y los firman con su huella.</w:t>
             </w:r>
           </w:p>
         </w:tc>
@@ -4170,7 +4200,7 @@
         <w:rPr>
           <w:rFonts w:cs="Times New Roman"/>
         </w:rPr>
-        <w:t>Humanos: Docente practicante, docente tutora del aula y estudiantes del grado.</w:t>
+        <w:t>Humanos: Docente practicante, docente tutora del aula y niños de cuarto año de básica.</w:t>
       </w:r>
     </w:p>
     <w:p>
@@ -4188,7 +4218,7 @@
         <w:rPr>
           <w:rFonts w:cs="Times New Roman"/>
         </w:rPr>
-        <w:t>Materiales: Cuadernos, hojas, papel bond, lápices, borradores, esferos, colores, pintura, marcadores, pizarra y libro de lectura Nacho Lee.</w:t>
+        <w:t>Materiales: Tarjetas con caritas de emociones, paletas de colores verde, amarilla y roja, hojas con el dibujo del termómetro de las emociones, papelógrafos, marcadores, colores, lápices, cinta adhesiva, globos, rompecabezas grande, pintura para las huellas y pizarra.</w:t>
       </w:r>
     </w:p>
     <w:p>
@@ -4649,7 +4679,7 @@
         <w:ind w:firstLine="0"/>
       </w:pPr>
       <w:r>
-        <w:t xml:space="preserve">La evaluación del proyecto se realizó durante los talleres, usando como evidencia lo que se observó con los estudiantes de cuarto año en cada clase:</w:t>
+        <w:t xml:space="preserve">La evaluación del proyecto se realizó durante los talleres, usando como evidencia lo que se observó con los niños de cuarto año en cada actividad:</w:t>
       </w:r>
     </w:p>
     <w:p>
@@ -4664,10 +4694,10 @@
           <w:b/>
           <w:bCs/>
         </w:rPr>
-        <w:t>Observación diaria:</w:t>
-      </w:r>
-      <w:r>
-        <w:t xml:space="preserve"> en cada taller se observó el comportamiento de los estudiantes y la forma en que expresaban sus emociones, para saber quiénes tenían más dificultad para controlarse o hablar con calma.</w:t>
+        <w:t>Diagnóstico inicial:</w:t>
+      </w:r>
+      <w:r>
+        <w:t xml:space="preserve"> las actividades con las tarjetas de caritas y el semáforo de las emociones permitieron conocer las emociones más frecuentes del grupo y las situaciones que generaban más conflictos entre compañeros.</w:t>
       </w:r>
     </w:p>
     <w:p>
@@ -4685,7 +4715,7 @@
         <w:t>Seguimiento individual:</w:t>
       </w:r>
       <w:r>
-        <w:t xml:space="preserve"> se trabajó de cerca con los niños que mostraban más dificultad para controlar el enojo o para decir lo que sentían, acompañándolos en cada taller para ver su progreso.</w:t>
+        <w:t xml:space="preserve"> en cada taller se observó el comportamiento de los niños y se trabajó de cerca con quienes mostraban más dificultad para controlar el enojo o para decir lo que sentían, acompañándolos para ver su progreso.</w:t>
       </w:r>
     </w:p>
     <w:p>
@@ -4700,10 +4730,10 @@
           <w:b/>
           <w:bCs/>
         </w:rPr>
-        <w:t>Participación en las dinámicas:</w:t>
-      </w:r>
-      <w:r>
-        <w:t xml:space="preserve"> las dinámicas al inicio de cada taller sirvieron para ver el interés y las ganas de participar de los estudiantes en las actividades sobre emociones y resolución de conflictos.</w:t>
+        <w:t>Uso de técnicas de calma:</w:t>
+      </w:r>
+      <w:r>
+        <w:t xml:space="preserve"> se observó si los niños usaban la respiración del globo, la técnica de la tortuga o contar hasta diez cuando sentían enojo o frustración.</w:t>
       </w:r>
     </w:p>
     <w:p>
@@ -4718,10 +4748,10 @@
           <w:b/>
           <w:bCs/>
         </w:rPr>
-        <w:t>Trabajo con la familia:</w:t>
-      </w:r>
-      <w:r>
-        <w:t xml:space="preserve"> la reunión con las madres de familia sirvió para hablar sobre el comportamiento de los niños en casa y reforzar en el hogar lo aprendido en los talleres.</w:t>
+        <w:t>Resolución de conflictos:</w:t>
+      </w:r>
+      <w:r>
+        <w:t xml:space="preserve"> en “La mesa de la paz” se revisó si los niños seguían los pasos para resolver un desacuerdo, hablando con calma y escuchando a su compañero.</w:t>
       </w:r>
     </w:p>
     <w:p>
@@ -4736,15 +4766,33 @@
           <w:b/>
           <w:bCs/>
         </w:rPr>
+        <w:t>Trabajo en equipo:</w:t>
+      </w:r>
+      <w:r>
+        <w:t xml:space="preserve"> los juegos cooperativos sirvieron para ver el respeto entre compañeros, la ayuda mutua y la forma en que se ponían de acuerdo.</w:t>
+      </w:r>
+    </w:p>
+    <w:p>
+      <w:pPr>
+        <w:numPr>
+          <w:ilvl w:val="0"/>
+          <w:numId w:val="24"/>
+        </w:numPr>
+      </w:pPr>
+      <w:r>
+        <w:rPr>
+          <w:b/>
+          <w:bCs/>
+        </w:rPr>
         <w:t>Cierre del proyecto:</w:t>
       </w:r>
       <w:r>
-        <w:t xml:space="preserve"> la participación de los estudiantes en la actividad de cierre mostró que aprendieron a respetar a sus compañeros, a trabajar en equipo y a resolver sus diferencias hablando en lugar de pelear.</w:t>
-      </w:r>
-    </w:p>
-    <w:p>
-      <w:r>
-        <w:t>Con lo observado se pudo ver que los estudiantes lograron reconocer sus emociones y resolver sus diferencias mediante el diálogo. También mostraron más respeto entre compañeros y más ganas de trabajar en equipo durante los talleres. Esto muestra que el trabajo realizado ayudó a mejorar la forma en que los niños manejan sus emociones y solucionan los conflictos en el aula.</w:t>
+        <w:t xml:space="preserve"> la elaboración del pacto de convivencia mostró lo que los niños aprendieron y su compromiso de resolver sus diferencias hablando en lugar de pelear.</w:t>
+      </w:r>
+    </w:p>
+    <w:p>
+      <w:r>
+        <w:t>Con lo observado se pudo ver que los niños lograron reconocer sus emociones, usar técnicas sencillas para calmarse y resolver sus diferencias mediante el diálogo. También mostraron más respeto entre compañeros y más ganas de trabajar en equipo durante los talleres. Esto muestra que el trabajo realizado ayudó a mejorar la forma en que los niños manejan sus emociones y solucionan los conflictos en el aula.</w:t>
       </w:r>
     </w:p>
     <w:p>

</xml_diff>